<commit_message>
Recall audit: +24 bills from extended subject-index headings, special sessions verified clean, packet rebuilt (108 policy bills)
Co-authored-by: CaptainWrechols <CaptainWrechols@users.noreply.github.com>
</commit_message>
<xml_diff>
--- a/briefs/nevada/water-scarcity/citizen-v1/citizen-brief.docx
+++ b/briefs/nevada/water-scarcity/citizen-v1/citizen-brief.docx
@@ -103,7 +103,7 @@
           <w:bCs/>
           <w:b/>
         </w:rPr>
-        <w:t xml:space="preserve">100</w:t>
+        <w:t xml:space="preserve">108</w:t>
       </w:r>
       <w:r>
         <w:t xml:space="preserve"> </w:t>
@@ -141,7 +141,7 @@
           <w:bCs/>
           <w:b/>
         </w:rPr>
-        <w:t xml:space="preserve">52</w:t>
+        <w:t xml:space="preserve">59</w:t>
       </w:r>
       <w:r>
         <w:t xml:space="preserve"> </w:t>
@@ -163,7 +163,7 @@
           <w:bCs/>
           <w:b/>
         </w:rPr>
-        <w:t xml:space="preserve">26</w:t>
+        <w:t xml:space="preserve">27</w:t>
       </w:r>
       <w:r>
         <w:t xml:space="preserve"> </w:t>
@@ -681,7 +681,7 @@
         <w:pStyle w:val="Compact"/>
       </w:pPr>
       <w:r>
-        <w:t xml:space="preserve">Money for water projects: 11 of 13 became law — grants, dams, studies (2023 AB19 · became law)</w:t>
+        <w:t xml:space="preserve">Money for water projects: 14 of 17 became law — grants, dams, studies (2023 AB19 · became law)</w:t>
       </w:r>
     </w:p>
     <w:p>
@@ -885,7 +885,7 @@
         <w:pStyle w:val="Compact"/>
       </w:pPr>
       <w:r>
-        <w:t xml:space="preserve">Half the bills came from committees, half from named lawmakers. A</w:t>
+        <w:t xml:space="preserve">A slight majority of bills (58 of 108) came from committees rather than named lawmakers. A</w:t>
       </w:r>
       <w:r>
         <w:t xml:space="preserve"> </w:t>
@@ -937,7 +937,7 @@
         <w:pStyle w:val="Compact"/>
       </w:pPr>
       <w:r>
-        <w:t xml:space="preserve">Of 26 first-committee deaths, 14 happened in a Natural Resources committee. Both data-center tax-break restraints died in Assembly Revenue.</w:t>
+        <w:t xml:space="preserve">Of 27 first-committee deaths, 15 happened in a Natural Resources committee. Both data-center tax-break restraints died in Assembly Revenue.</w:t>
       </w:r>
     </w:p>
     <w:p>
@@ -1177,7 +1177,7 @@
         <w:pStyle w:val="FirstParagraph"/>
       </w:pPr>
       <w:r>
-        <w:t xml:space="preserve">This set was found by keyword search plus the Legislature’s official subject index — 100 policy bills, not a guaranteed complete universe. The record shows where each bill stopped, never why. The appendices in this folder list every bill, vote, sponsor, and source behind this sheet.</w:t>
+        <w:t xml:space="preserve">This set was found by keyword search plus the Legislature’s official subject index, with special sessions checked too — 108 policy bills, still not a guaranteed complete universe. The record shows where each bill stopped, never why. The appendices in this folder list every bill, vote, sponsor, and source behind this sheet.</w:t>
       </w:r>
     </w:p>
     <w:bookmarkEnd w:id="28"/>
@@ -1256,7 +1256,7 @@
               <w:jc w:val="left"/>
             </w:pPr>
             <w:r>
-              <w:t xml:space="preserve">100 policy bills; 52 enacted; 26 first-committee deaths; 3 vetoes; 4 sessions</w:t>
+              <w:t xml:space="preserve">108 policy bills; 59 enacted; 27 first-committee deaths; 3 vetoes; 4 sessions</w:t>
             </w:r>
           </w:p>
         </w:tc>
@@ -1787,7 +1787,7 @@
               <w:jc w:val="left"/>
             </w:pPr>
             <w:r>
-              <w:t xml:space="preserve">Goicoechea 14 bills; 5 cross-party bills, 4 enacted; 50/50 sponsorship</w:t>
+              <w:t xml:space="preserve">Goicoechea 14 bills; 5 cross-party bills, 4 enacted; 58/50 committee-vs-person sponsorship</w:t>
             </w:r>
           </w:p>
         </w:tc>
@@ -1816,7 +1816,7 @@
               <w:jc w:val="left"/>
             </w:pPr>
             <w:r>
-              <w:t xml:space="preserve">14 of 26 first-committee deaths in Natural Resources</w:t>
+              <w:t xml:space="preserve">15 of 27 first-committee deaths in Natural Resources</w:t>
             </w:r>
           </w:p>
         </w:tc>

</xml_diff>